<commit_message>
Add automate percentage calculation to RARE and Protected Series templaate
</commit_message>
<xml_diff>
--- a/templates/Note_and_DOT_Protected_Series__Template.docx
+++ b/templates/Note_and_DOT_Protected_Series__Template.docx
@@ -774,7 +774,7 @@
           <w:sz w:val="24"/>
           <w:szCs w:val="24"/>
         </w:rPr>
-        <w:t>WRITTEN_PRINCIPALAMOUNT</w:t>
+        <w:t>PERCENT_AMOUNT</w:t>
       </w:r>
       <w:r>
         <w:t>}}</w:t>
@@ -4592,13 +4592,20 @@
         <w:t xml:space="preserve">That </w:t>
       </w:r>
       <w:r>
-        <w:t xml:space="preserve">CEDAR </w:t>
-      </w:r>
-      <w:r>
-        <w:t>PARK VENTURES</w:t>
-      </w:r>
-      <w:r>
-        <w:t xml:space="preserve">, PROTECTED SERIES </w:t>
+        <w:t>{{</w:t>
+      </w:r>
+      <w:r>
+        <w:rPr>
+          <w:sz w:val="24"/>
+          <w:szCs w:val="24"/>
+        </w:rPr>
+        <w:t>PROTECTEDSERIES_NAME</w:t>
+      </w:r>
+      <w:r>
+        <w:t>}}</w:t>
+      </w:r>
+      <w:r>
+        <w:t xml:space="preserve"> </w:t>
       </w:r>
       <w:r>
         <w:t>purposes and trust hereinafter recited, have GRANTED,</w:t>

</xml_diff>